<commit_message>
added api in cases and incedents for pdf conversion
</commit_message>
<xml_diff>
--- a/cases/cases.docx
+++ b/cases/cases.docx
@@ -17,7 +17,7 @@
           <w:noProof/>
         </w:rPr>
         <w:drawing>
-          <wp:anchor distT="0" distB="0" distL="114300" distR="114300" simplePos="0" relativeHeight="251656704" behindDoc="1" locked="0" layoutInCell="1" allowOverlap="1" wp14:anchorId="56073C0A" wp14:editId="6E9732A8">
+          <wp:anchor distT="0" distB="0" distL="114300" distR="114300" simplePos="0" relativeHeight="251656704" behindDoc="1" locked="0" layoutInCell="1" allowOverlap="1" wp14:anchorId="56073C0A" wp14:editId="37487A26">
             <wp:simplePos x="0" y="0"/>
             <wp:positionH relativeFrom="column">
               <wp:posOffset>-48895</wp:posOffset>
@@ -26,7 +26,7 @@
               <wp:posOffset>-48895</wp:posOffset>
             </wp:positionV>
             <wp:extent cx="1430020" cy="1343025"/>
-            <wp:effectExtent l="0" t="0" r="0" b="9525"/>
+            <wp:effectExtent l="0" t="0" r="0" b="0"/>
             <wp:wrapNone/>
             <wp:docPr id="1" name="Picture 1" descr="C:\Users\user\Desktop\aesgsdg - Copy - Copy.jpg"/>
             <wp:cNvGraphicFramePr/>
@@ -38,7 +38,22 @@
                     <pic:cNvPicPr/>
                   </pic:nvPicPr>
                   <pic:blipFill>
-                    <a:blip r:embed="rId4" cstate="print"/>
+                    <a:blip r:embed="rId4" cstate="print">
+                      <a:extLst>
+                        <a:ext uri="{BEBA8EAE-BF5A-486C-A8C5-ECC9F3942E4B}">
+                          <a14:imgProps xmlns:a14="http://schemas.microsoft.com/office/drawing/2010/main">
+                            <a14:imgLayer r:embed="rId5">
+                              <a14:imgEffect>
+                                <a14:backgroundRemoval t="9907" b="89783" l="9012" r="89826">
+                                  <a14:foregroundMark x1="9012" y1="63158" x2="10465" y2="39319"/>
+                                  <a14:foregroundMark x1="10465" y1="64396" x2="10465" y2="60991"/>
+                                </a14:backgroundRemoval>
+                              </a14:imgEffect>
+                            </a14:imgLayer>
+                          </a14:imgProps>
+                        </a:ext>
+                      </a:extLst>
+                    </a:blip>
                     <a:srcRect/>
                     <a:stretch>
                       <a:fillRect/>
@@ -52,12 +67,6 @@
                     <a:prstGeom prst="rect">
                       <a:avLst/>
                     </a:prstGeom>
-                    <a:ln>
-                      <a:noFill/>
-                    </a:ln>
-                    <a:effectLst>
-                      <a:softEdge rad="112500"/>
-                    </a:effectLst>
                   </pic:spPr>
                 </pic:pic>
               </a:graphicData>
@@ -258,8 +267,8 @@
         <w:tblLook w:val="04A0" w:firstRow="1" w:lastRow="0" w:firstColumn="1" w:lastColumn="0" w:noHBand="0" w:noVBand="1"/>
       </w:tblPr>
       <w:tblGrid>
-        <w:gridCol w:w="3714"/>
-        <w:gridCol w:w="5636"/>
+        <w:gridCol w:w="3708"/>
+        <w:gridCol w:w="5642"/>
       </w:tblGrid>
       <w:tr>
         <w:tc>
@@ -287,7 +296,7 @@
                 <w:rFonts w:ascii="Century Gothic" w:hAnsi="Century Gothic"/>
                 <w:sz w:val="24"/>
               </w:rPr>
-              <w:t xml:space="preserve"> </w:t>
+              <w:t xml:space="preserve"> ${name}</w:t>
             </w:r>
           </w:p>
         </w:tc>
@@ -327,6 +336,13 @@
               </w:rPr>
               <w:t xml:space="preserve"> </w:t>
             </w:r>
+            <w:r>
+              <w:rPr>
+                <w:rFonts w:ascii="Century Gothic" w:hAnsi="Century Gothic"/>
+                <w:sz w:val="24"/>
+              </w:rPr>
+              <w:t>${purok}</w:t>
+            </w:r>
           </w:p>
         </w:tc>
       </w:tr>
@@ -350,6 +366,13 @@
                 <w:sz w:val="24"/>
               </w:rPr>
               <w:t xml:space="preserve">BARANGAY: </w:t>
+            </w:r>
+            <w:r>
+              <w:rPr>
+                <w:rFonts w:ascii="Century Gothic" w:hAnsi="Century Gothic"/>
+                <w:sz w:val="24"/>
+              </w:rPr>
+              <w:t>${barangay}</w:t>
             </w:r>
           </w:p>
         </w:tc>
@@ -430,6 +453,13 @@
               </w:rPr>
               <w:t xml:space="preserve">LOCATION: </w:t>
             </w:r>
+            <w:r>
+              <w:rPr>
+                <w:rFonts w:ascii="Century Gothic" w:hAnsi="Century Gothic"/>
+                <w:sz w:val="24"/>
+              </w:rPr>
+              <w:t>${location}</w:t>
+            </w:r>
           </w:p>
         </w:tc>
       </w:tr>
@@ -453,6 +483,13 @@
               </w:rPr>
               <w:t xml:space="preserve">DATE: </w:t>
             </w:r>
+            <w:r>
+              <w:rPr>
+                <w:rFonts w:ascii="Century Gothic" w:hAnsi="Century Gothic"/>
+                <w:sz w:val="24"/>
+              </w:rPr>
+              <w:t>${date}</w:t>
+            </w:r>
           </w:p>
         </w:tc>
         <w:tc>
@@ -490,6 +527,13 @@
               </w:rPr>
               <w:t xml:space="preserve">TIME: </w:t>
             </w:r>
+            <w:r>
+              <w:rPr>
+                <w:rFonts w:ascii="Century Gothic" w:hAnsi="Century Gothic"/>
+                <w:sz w:val="24"/>
+              </w:rPr>
+              <w:t>${time}</w:t>
+            </w:r>
           </w:p>
         </w:tc>
         <w:tc>
@@ -551,6 +595,29 @@
                 <w:sz w:val="24"/>
               </w:rPr>
             </w:pPr>
+            <w:r>
+              <w:rPr>
+                <w:rFonts w:ascii="Century Gothic" w:hAnsi="Century Gothic"/>
+                <w:sz w:val="24"/>
+              </w:rPr>
+              <w:t>${</w:t>
+            </w:r>
+            <w:proofErr w:type="spellStart"/>
+            <w:r>
+              <w:rPr>
+                <w:rFonts w:ascii="Century Gothic" w:hAnsi="Century Gothic"/>
+                <w:sz w:val="24"/>
+              </w:rPr>
+              <w:t>yesOrNo</w:t>
+            </w:r>
+            <w:proofErr w:type="spellEnd"/>
+            <w:r>
+              <w:rPr>
+                <w:rFonts w:ascii="Century Gothic" w:hAnsi="Century Gothic"/>
+                <w:sz w:val="24"/>
+              </w:rPr>
+              <w:t>}</w:t>
+            </w:r>
           </w:p>
         </w:tc>
         <w:tc>
@@ -607,6 +674,29 @@
               </w:rPr>
               <w:t xml:space="preserve"> </w:t>
             </w:r>
+            <w:r>
+              <w:rPr>
+                <w:rFonts w:ascii="Century Gothic" w:hAnsi="Century Gothic"/>
+                <w:sz w:val="24"/>
+              </w:rPr>
+              <w:t>${</w:t>
+            </w:r>
+            <w:proofErr w:type="spellStart"/>
+            <w:r>
+              <w:rPr>
+                <w:rFonts w:ascii="Century Gothic" w:hAnsi="Century Gothic"/>
+                <w:sz w:val="24"/>
+              </w:rPr>
+              <w:t>incidentType</w:t>
+            </w:r>
+            <w:proofErr w:type="spellEnd"/>
+            <w:r>
+              <w:rPr>
+                <w:rFonts w:ascii="Century Gothic" w:hAnsi="Century Gothic"/>
+                <w:sz w:val="24"/>
+              </w:rPr>
+              <w:t>}</w:t>
+            </w:r>
           </w:p>
           <w:p>
             <w:pPr>
@@ -633,6 +723,56 @@
                 <w:sz w:val="24"/>
               </w:rPr>
               <w:t>Injuries Sustained:</w:t>
+            </w:r>
+            <w:r>
+              <w:rPr>
+                <w:rFonts w:ascii="Century Gothic" w:hAnsi="Century Gothic"/>
+                <w:b/>
+                <w:bCs/>
+                <w:sz w:val="24"/>
+              </w:rPr>
+              <w:t xml:space="preserve"> </w:t>
+            </w:r>
+          </w:p>
+          <w:p>
+            <w:pPr>
+              <w:rPr>
+                <w:rFonts w:ascii="Century Gothic" w:hAnsi="Century Gothic"/>
+                <w:b/>
+                <w:bCs/>
+                <w:sz w:val="24"/>
+              </w:rPr>
+            </w:pPr>
+          </w:p>
+          <w:p>
+            <w:pPr>
+              <w:rPr>
+                <w:rFonts w:ascii="Century Gothic" w:hAnsi="Century Gothic"/>
+                <w:sz w:val="24"/>
+              </w:rPr>
+            </w:pPr>
+            <w:r>
+              <w:rPr>
+                <w:rFonts w:ascii="Century Gothic" w:hAnsi="Century Gothic"/>
+                <w:sz w:val="24"/>
+              </w:rPr>
+              <w:t>${</w:t>
+            </w:r>
+            <w:proofErr w:type="spellStart"/>
+            <w:r>
+              <w:rPr>
+                <w:rFonts w:ascii="Century Gothic" w:hAnsi="Century Gothic"/>
+                <w:sz w:val="24"/>
+              </w:rPr>
+              <w:t>injuriesSustained</w:t>
+            </w:r>
+            <w:proofErr w:type="spellEnd"/>
+            <w:r>
+              <w:rPr>
+                <w:rFonts w:ascii="Century Gothic" w:hAnsi="Century Gothic"/>
+                <w:sz w:val="24"/>
+              </w:rPr>
+              <w:t>}</w:t>
             </w:r>
           </w:p>
           <w:p>
@@ -701,10 +841,37 @@
             <w:pPr>
               <w:rPr>
                 <w:rFonts w:ascii="Century Gothic" w:hAnsi="Century Gothic"/>
+                <w:b/>
+                <w:bCs/>
+                <w:sz w:val="24"/>
+              </w:rPr>
+            </w:pPr>
+            <w:r>
+              <w:rPr>
+                <w:rFonts w:ascii="Century Gothic" w:hAnsi="Century Gothic"/>
+                <w:b/>
+                <w:bCs/>
+                <w:sz w:val="24"/>
+              </w:rPr>
+              <w:t>${NAME}</w:t>
+            </w:r>
+          </w:p>
+          <w:p>
+            <w:pPr>
+              <w:rPr>
+                <w:rFonts w:ascii="Century Gothic" w:hAnsi="Century Gothic"/>
                 <w:sz w:val="20"/>
                 <w:szCs w:val="18"/>
               </w:rPr>
             </w:pPr>
+            <w:r>
+              <w:rPr>
+                <w:rFonts w:ascii="Century Gothic" w:hAnsi="Century Gothic"/>
+                <w:sz w:val="20"/>
+                <w:szCs w:val="18"/>
+              </w:rPr>
+              <w:t>${date}</w:t>
+            </w:r>
           </w:p>
           <w:p>
             <w:pPr>

</xml_diff>

<commit_message>
change the the default filename format to name of the person,
</commit_message>
<xml_diff>
--- a/cases/cases.docx
+++ b/cases/cases.docx
@@ -836,6 +836,15 @@
               </w:rPr>
               <w:t>Name of individual submitting the report:</w:t>
             </w:r>
+          </w:p>
+          <w:p>
+            <w:pPr>
+              <w:rPr>
+                <w:rFonts w:ascii="Century Gothic" w:hAnsi="Century Gothic"/>
+                <w:sz w:val="20"/>
+                <w:szCs w:val="18"/>
+              </w:rPr>
+            </w:pPr>
           </w:p>
           <w:p>
             <w:pPr>

</xml_diff>